<commit_message>
Шаблон 1layer: секция фотографий — {{photos?}}…{{photos.image}}/{{photos.caption}}
Co-Authored-By: Claude Opus 4.8 (1M context) <noreply@anthropic.com>
</commit_message>
<xml_diff>
--- a/app/src/Reports/Infrastructure/Resources/templates/trial_application_1layer.docx
+++ b/app/src/Reports/Infrastructure/Resources/templates/trial_application_1layer.docx
@@ -832,13 +832,7 @@
               <w:rPr>
                 <w:rFonts w:cs="Arial" w:ascii="Arial" w:hAnsi="Arial" w:asciiTheme="minorHAnsi" w:cstheme="minorHAnsi" w:hAnsiTheme="minorHAnsi"/>
               </w:rPr>
-              <w:t>}}</w:t>
-            </w:r>
-            <w:r>
-              <w:rPr>
-                <w:rFonts w:cs="Arial" w:ascii="Arial" w:hAnsi="Arial" w:asciiTheme="minorHAnsi" w:cstheme="minorHAnsi" w:hAnsiTheme="minorHAnsi"/>
-              </w:rPr>
-              <w:t>{{/</w:t>
+              <w:t>}}{{/</w:t>
             </w:r>
             <w:r>
               <w:rPr>
@@ -864,13 +858,7 @@
               <w:rPr>
                 <w:rFonts w:cs="Arial" w:ascii="Arial" w:hAnsi="Arial" w:asciiTheme="minorHAnsi" w:cstheme="minorHAnsi" w:hAnsiTheme="minorHAnsi"/>
               </w:rPr>
-              <w:t>}}</w:t>
-            </w:r>
-            <w:r>
-              <w:rPr>
-                <w:rFonts w:cs="Arial" w:ascii="Arial" w:hAnsi="Arial" w:asciiTheme="minorHAnsi" w:cstheme="minorHAnsi" w:hAnsiTheme="minorHAnsi"/>
-              </w:rPr>
-              <w:t>;</w:t>
+              <w:t>}};</w:t>
             </w:r>
           </w:p>
         </w:tc>
@@ -3025,6 +3013,199 @@
         </w:tc>
       </w:tr>
     </w:tbl>
+    <w:p>
+      <w:pPr>
+        <w:pStyle w:val="Normal"/>
+        <w:spacing w:before="120" w:after="0"/>
+        <w:rPr>
+          <w:rFonts w:ascii="Arial" w:hAnsi="Arial" w:cs="Arial" w:asciiTheme="minorHAnsi" w:cstheme="minorHAnsi" w:hAnsiTheme="minorHAnsi"/>
+        </w:rPr>
+      </w:pPr>
+      <w:r>
+        <w:rPr>
+          <w:rFonts w:cs="Arial" w:cstheme="minorHAnsi" w:ascii="Arial" w:hAnsi="Arial"/>
+        </w:rPr>
+      </w:r>
+      <w:r>
+        <w:br w:type="page"/>
+      </w:r>
+    </w:p>
+    <w:p>
+      <w:pPr>
+        <w:pStyle w:val="Normal"/>
+        <w:spacing w:before="120" w:after="0"/>
+        <w:rPr>
+          <w:rFonts w:ascii="Arial" w:hAnsi="Arial" w:cs="Arial" w:asciiTheme="minorHAnsi" w:cstheme="minorHAnsi" w:hAnsiTheme="minorHAnsi"/>
+        </w:rPr>
+      </w:pPr>
+      <w:r>
+        <w:rPr>
+          <w:rFonts w:cs="Arial" w:cstheme="minorHAnsi" w:ascii="Arial" w:hAnsi="Arial"/>
+        </w:rPr>
+      </w:r>
+    </w:p>
+    <w:p>
+      <w:pPr>
+        <w:pStyle w:val="Normal"/>
+        <w:spacing w:before="120" w:after="0"/>
+        <w:rPr>
+          <w:rFonts w:ascii="Arial" w:hAnsi="Arial" w:cs="Arial" w:asciiTheme="minorHAnsi" w:cstheme="minorHAnsi" w:hAnsiTheme="minorHAnsi"/>
+        </w:rPr>
+      </w:pPr>
+      <w:r>
+        <w:rPr>
+          <w:rFonts w:cs="Arial" w:cstheme="minorHAnsi" w:ascii="Arial" w:hAnsi="Arial"/>
+        </w:rPr>
+      </w:r>
+    </w:p>
+    <w:p>
+      <w:pPr>
+        <w:pStyle w:val="Normal"/>
+        <w:spacing w:before="120" w:after="0"/>
+        <w:rPr>
+          <w:rFonts w:ascii="Arial" w:hAnsi="Arial" w:cs="Arial" w:asciiTheme="minorHAnsi" w:cstheme="minorHAnsi" w:hAnsiTheme="minorHAnsi"/>
+        </w:rPr>
+      </w:pPr>
+      <w:r>
+        <w:rPr>
+          <w:rFonts w:cs="Arial" w:cstheme="minorHAnsi" w:ascii="Arial" w:hAnsi="Arial"/>
+        </w:rPr>
+        <w:t>{{photos?}}</w:t>
+      </w:r>
+    </w:p>
+    <w:tbl>
+      <w:tblPr>
+        <w:tblW w:w="5000" w:type="pct"/>
+        <w:jc w:val="start"/>
+        <w:tblInd w:w="-5" w:type="dxa"/>
+        <w:tblLayout w:type="fixed"/>
+        <w:tblCellMar>
+          <w:top w:w="55" w:type="dxa"/>
+          <w:start w:w="55" w:type="dxa"/>
+          <w:bottom w:w="55" w:type="dxa"/>
+          <w:end w:w="55" w:type="dxa"/>
+        </w:tblCellMar>
+      </w:tblPr>
+      <w:tblGrid>
+        <w:gridCol w:w="9796"/>
+      </w:tblGrid>
+      <w:tr>
+        <w:trPr/>
+        <w:tc>
+          <w:tcPr>
+            <w:tcW w:w="9796" w:type="dxa"/>
+            <w:tcBorders>
+              <w:top w:val="single" w:sz="4" w:space="0" w:color="000000"/>
+              <w:start w:val="single" w:sz="4" w:space="0" w:color="000000"/>
+              <w:bottom w:val="single" w:sz="4" w:space="0" w:color="000000"/>
+              <w:end w:val="single" w:sz="4" w:space="0" w:color="000000"/>
+            </w:tcBorders>
+          </w:tcPr>
+          <w:p>
+            <w:pPr>
+              <w:pStyle w:val="Normal"/>
+              <w:spacing w:before="120" w:after="0"/>
+              <w:rPr/>
+            </w:pPr>
+            <w:r>
+              <w:rPr>
+                <w:rFonts w:cs="Arial" w:ascii="Arial" w:hAnsi="Arial" w:asciiTheme="minorHAnsi" w:cstheme="minorHAnsi" w:hAnsiTheme="minorHAnsi"/>
+              </w:rPr>
+              <w:t xml:space="preserve">{{photos.image}} </w:t>
+            </w:r>
+          </w:p>
+        </w:tc>
+      </w:tr>
+      <w:tr>
+        <w:trPr/>
+        <w:tc>
+          <w:tcPr>
+            <w:tcW w:w="9796" w:type="dxa"/>
+            <w:tcBorders>
+              <w:start w:val="single" w:sz="4" w:space="0" w:color="000000"/>
+              <w:bottom w:val="single" w:sz="4" w:space="0" w:color="000000"/>
+              <w:end w:val="single" w:sz="4" w:space="0" w:color="000000"/>
+            </w:tcBorders>
+          </w:tcPr>
+          <w:p>
+            <w:pPr>
+              <w:pStyle w:val="Normal"/>
+              <w:spacing w:before="120" w:after="0"/>
+              <w:rPr/>
+            </w:pPr>
+            <w:r>
+              <w:rPr>
+                <w:rFonts w:cs="Arial" w:ascii="Arial" w:hAnsi="Arial" w:asciiTheme="minorHAnsi" w:cstheme="minorHAnsi" w:hAnsiTheme="minorHAnsi"/>
+              </w:rPr>
+              <w:t>{{photos.caption}}</w:t>
+            </w:r>
+          </w:p>
+        </w:tc>
+      </w:tr>
+    </w:tbl>
+    <w:p>
+      <w:pPr>
+        <w:pStyle w:val="Normal"/>
+        <w:spacing w:before="120" w:after="0"/>
+        <w:rPr>
+          <w:rFonts w:ascii="Arial" w:hAnsi="Arial" w:cs="Arial" w:asciiTheme="minorHAnsi" w:cstheme="minorHAnsi" w:hAnsiTheme="minorHAnsi"/>
+        </w:rPr>
+      </w:pPr>
+      <w:r>
+        <w:rPr>
+          <w:rFonts w:cs="Arial" w:cstheme="minorHAnsi" w:ascii="Arial" w:hAnsi="Arial"/>
+        </w:rPr>
+        <w:t>{{/photos?}}</w:t>
+      </w:r>
+    </w:p>
+    <w:p>
+      <w:pPr>
+        <w:pStyle w:val="Normal"/>
+        <w:spacing w:before="120" w:after="0"/>
+        <w:rPr>
+          <w:rFonts w:ascii="Arial" w:hAnsi="Arial" w:cs="Arial" w:asciiTheme="minorHAnsi" w:cstheme="minorHAnsi" w:hAnsiTheme="minorHAnsi"/>
+        </w:rPr>
+      </w:pPr>
+      <w:r>
+        <w:rPr>
+          <w:rFonts w:cs="Arial" w:cstheme="minorHAnsi" w:ascii="Arial" w:hAnsi="Arial"/>
+        </w:rPr>
+      </w:r>
+      <w:r>
+        <w:br w:type="page"/>
+      </w:r>
+    </w:p>
+    <w:p>
+      <w:pPr>
+        <w:pStyle w:val="Normal"/>
+        <w:spacing w:before="120" w:after="0"/>
+        <w:rPr>
+          <w:rFonts w:ascii="Arial" w:hAnsi="Arial" w:cs="Arial" w:asciiTheme="minorHAnsi" w:cstheme="minorHAnsi" w:hAnsiTheme="minorHAnsi"/>
+        </w:rPr>
+      </w:pPr>
+      <w:r>
+        <w:rPr>
+          <w:rFonts w:cs="Arial" w:cstheme="minorHAnsi" w:ascii="Arial" w:hAnsi="Arial"/>
+        </w:rPr>
+      </w:r>
+    </w:p>
+    <w:p>
+      <w:pPr>
+        <w:pStyle w:val="Normal"/>
+        <w:spacing w:before="120" w:after="0"/>
+        <w:rPr>
+          <w:rFonts w:ascii="Arial" w:hAnsi="Arial" w:cs="Arial" w:asciiTheme="minorHAnsi" w:cstheme="minorHAnsi" w:hAnsiTheme="minorHAnsi"/>
+        </w:rPr>
+      </w:pPr>
+      <w:r>
+        <w:rPr>
+          <w:rFonts w:cs="Arial" w:cstheme="minorHAnsi" w:ascii="Arial" w:hAnsi="Arial"/>
+        </w:rPr>
+      </w:r>
+      <w:r>
+        <w:br w:type="page"/>
+      </w:r>
+    </w:p>
     <w:p>
       <w:pPr>
         <w:pStyle w:val="Normal"/>
@@ -3087,7 +3268,7 @@
       <mc:AlternateContent>
         <mc:Choice Requires="wps">
           <w:drawing>
-            <wp:anchor distT="8255" distB="8255" distL="0" distR="0" simplePos="0" relativeHeight="7" behindDoc="1" locked="0" layoutInCell="1" allowOverlap="1" wp14:anchorId="0D5B4059">
+            <wp:anchor distT="8255" distB="8255" distL="0" distR="0" simplePos="0" relativeHeight="13" behindDoc="1" locked="0" layoutInCell="1" allowOverlap="1" wp14:anchorId="0D5B4059">
               <wp:simplePos x="0" y="0"/>
               <wp:positionH relativeFrom="column">
                 <wp:posOffset>0</wp:posOffset>
@@ -3185,7 +3366,7 @@
         <w:sz w:val="18"/>
         <w:szCs w:val="18"/>
       </w:rPr>
-      <w:t>3</w:t>
+      <w:t>6</w:t>
     </w:r>
     <w:r>
       <w:rPr>
@@ -3237,7 +3418,7 @@
         <w:szCs w:val="18"/>
         <w:lang w:eastAsia="ru-RU"/>
       </w:rPr>
-      <w:t>3</w:t>
+      <w:t>6</w:t>
     </w:r>
     <w:r>
       <w:rPr>
@@ -3284,7 +3465,7 @@
       <mc:AlternateContent>
         <mc:Choice Requires="wps">
           <w:drawing>
-            <wp:anchor distT="8255" distB="8255" distL="0" distR="0" simplePos="0" relativeHeight="7" behindDoc="1" locked="0" layoutInCell="1" allowOverlap="1" wp14:anchorId="0D5B4059">
+            <wp:anchor distT="8255" distB="8255" distL="0" distR="0" simplePos="0" relativeHeight="13" behindDoc="1" locked="0" layoutInCell="1" allowOverlap="1" wp14:anchorId="0D5B4059">
               <wp:simplePos x="0" y="0"/>
               <wp:positionH relativeFrom="column">
                 <wp:posOffset>0</wp:posOffset>
@@ -3382,7 +3563,7 @@
         <w:sz w:val="18"/>
         <w:szCs w:val="18"/>
       </w:rPr>
-      <w:t>3</w:t>
+      <w:t>6</w:t>
     </w:r>
     <w:r>
       <w:rPr>
@@ -3434,7 +3615,7 @@
         <w:szCs w:val="18"/>
         <w:lang w:eastAsia="ru-RU"/>
       </w:rPr>
-      <w:t>3</w:t>
+      <w:t>6</w:t>
     </w:r>
     <w:r>
       <w:rPr>
@@ -3495,7 +3676,7 @@
         <w:lang w:eastAsia="ru-RU"/>
       </w:rPr>
       <w:drawing>
-        <wp:anchor distT="0" distB="0" distL="0" distR="0" simplePos="0" relativeHeight="4" behindDoc="1" locked="0" layoutInCell="1" allowOverlap="1">
+        <wp:anchor distT="0" distB="0" distL="0" distR="0" simplePos="0" relativeHeight="7" behindDoc="1" locked="0" layoutInCell="1" allowOverlap="1">
           <wp:simplePos x="0" y="0"/>
           <wp:positionH relativeFrom="column">
             <wp:posOffset>4614545</wp:posOffset>
@@ -3575,7 +3756,7 @@
         <w:lang w:eastAsia="ru-RU"/>
       </w:rPr>
       <w:drawing>
-        <wp:anchor distT="0" distB="0" distL="0" distR="0" simplePos="0" relativeHeight="4" behindDoc="1" locked="0" layoutInCell="1" allowOverlap="1">
+        <wp:anchor distT="0" distB="0" distL="0" distR="0" simplePos="0" relativeHeight="7" behindDoc="1" locked="0" layoutInCell="1" allowOverlap="1">
           <wp:simplePos x="0" y="0"/>
           <wp:positionH relativeFrom="column">
             <wp:posOffset>4614545</wp:posOffset>
@@ -4799,7 +4980,7 @@
       <w:kern w:val="0"/>
       <w:sz w:val="24"/>
       <w:szCs w:val="24"/>
-      <w:lang w:bidi="ar-SA" w:val="ru-RU" w:eastAsia="zh-CN"/>
+      <w:lang w:val="ru-RU" w:eastAsia="zh-CN" w:bidi="ar-SA"/>
     </w:rPr>
   </w:style>
   <w:style w:type="paragraph" w:styleId="Heading1">
@@ -5459,7 +5640,7 @@
       <w:kern w:val="0"/>
       <w:sz w:val="24"/>
       <w:szCs w:val="24"/>
-      <w:lang w:bidi="ar-SA" w:val="ru-RU" w:eastAsia="zh-CN"/>
+      <w:lang w:val="ru-RU" w:eastAsia="zh-CN" w:bidi="ar-SA"/>
     </w:rPr>
   </w:style>
   <w:style w:type="paragraph" w:styleId="List">
@@ -5562,7 +5743,7 @@
       <w:kern w:val="0"/>
       <w:sz w:val="24"/>
       <w:szCs w:val="24"/>
-      <w:lang w:bidi="ar-SA" w:val="ru-RU" w:eastAsia="zh-CN"/>
+      <w:lang w:val="ru-RU" w:eastAsia="zh-CN" w:bidi="ar-SA"/>
     </w:rPr>
   </w:style>
   <w:style w:type="paragraph" w:styleId="BalloonText">
@@ -5593,7 +5774,7 @@
       <w:kern w:val="2"/>
       <w:sz w:val="24"/>
       <w:szCs w:val="24"/>
-      <w:lang w:bidi="ar-SA" w:val="ru-RU" w:eastAsia="zh-CN"/>
+      <w:lang w:val="ru-RU" w:eastAsia="zh-CN" w:bidi="ar-SA"/>
     </w:rPr>
   </w:style>
   <w:style w:type="paragraph" w:styleId="Style17" w:customStyle="1">

</xml_diff>